<commit_message>
Semana 8 adaptada a Finanzas y .docx regenerados
Co-Authored-By: Claude Opus 5.5 <noreply@anthropic.com>
Claude-Session: https://claude.ai/code/session_01BtpjWnwVSgH2GWthk4WDfq
</commit_message>
<xml_diff>
--- a/tareas-semana/3-Discussion-Initial-Post.docx
+++ b/tareas-semana/3-Discussion-Initial-Post.docx
@@ -29,7 +29,7 @@
           <w:color w:val="000000"/>
           <w:sz w:val="24"/>
         </w:rPr>
-        <w:t xml:space="preserve">Chapter 7 of College Success argues that college develops several kinds of higher-level thinking, including creative, analytical, critical, and problem-solving thinking, along with metacognition and information literacy (Baldwin, 2020). In my first-semester composition course, I was assigned an annotated bibliography of five sources for a research paper. At the time, it seemed pointless. I already knew how to search, and each entry felt like paperwork. I wondered why I could not simply list the first results my search returned.</w:t>
+        <w:t xml:space="preserve">Chapter 7 of College Success argues that college develops several kinds of higher-level thinking, including creative, analytical, critical, and problem-solving thinking, along with metacognition and information literacy (Baldwin, 2020). In my first-semester composition course, I was assigned an annotated bibliography of five sources for a research paper. At the time, it seemed pointless. I already knew how to search, and each entry felt like paperwork.</w:t>
       </w:r>
     </w:p>
     <w:p>
@@ -57,7 +57,7 @@
           <w:color w:val="000000"/>
           <w:sz w:val="24"/>
         </w:rPr>
-        <w:t xml:space="preserve">These habits will matter in computer science or web design. When I build web pages, I often compare developer documentation and tutorials to decide which are accurate and up to date, the same process I used for my sources. Writing a short annotation also resembles writing code comments that explain why a solution works, which helps when I return to a project months later. Baldwin (2020) lays out problem-solving as a sequence: identify the issue, consider other perspectives, generate several possible results, evaluate them, select the best, and set action items. I use that sequence when debugging a broken layout. The bibliography was not pointless after all. It taught me to examine a source before I trust it.</w:t>
+        <w:t xml:space="preserve">These habits will matter in finance. When I read analyst reports, earnings releases, or financial news, I need to check who wrote the piece, when it was published, and whether the author has a stake in the conclusion, the same process I used for my sources. Writing a short annotation also prepares me to summarize a company’s financial statements accurately, stating the main figures and what they suggest without adding my own opinion. When I compare two loan or investment options, I can use the problem-solving sequence Baldwin (2020) outlines: determine the issue, recognize other perspectives, think of multiple possible results, research and evaluate them, select the best, communicate findings, and establish action items. The bibliography was not pointless after all. It taught me to examine a source before I trust it.</w:t>
       </w:r>
     </w:p>
     <w:bookmarkStart w:id="20" w:name="references"/>

</xml_diff>

<commit_message>
Foro con la tarea real de Week 5 y semana 8 con el manejo real del dinero
Co-Authored-By: Claude Opus 5.5 <noreply@anthropic.com>
Claude-Session: https://claude.ai/code/session_01BtpjWnwVSgH2GWthk4WDfq
</commit_message>
<xml_diff>
--- a/tareas-semana/3-Discussion-Initial-Post.docx
+++ b/tareas-semana/3-Discussion-Initial-Post.docx
@@ -29,7 +29,7 @@
           <w:color w:val="000000"/>
           <w:sz w:val="24"/>
         </w:rPr>
-        <w:t xml:space="preserve">Chapter 7 of College Success argues that college develops several kinds of higher-level thinking, including creative, analytical, critical, and problem-solving thinking, along with metacognition and information literacy (Baldwin, 2020). In my first-semester composition course, I was assigned an annotated bibliography of five sources for a research paper. At the time, it seemed pointless. I already knew how to search, and each entry felt like paperwork.</w:t>
+        <w:t xml:space="preserve">Chapter 7 of College Success argues that college develops several kinds of higher-level thinking, including creative, analytical, critical, and problem-solving thinking, along with metacognition and information literacy (Baldwin, 2020). Honestly, no assignment has felt completely pointless so far, but the one I questioned most was the Week 5 academic planning assignment, which asked me to plan my courses and semesters toward my degree. At the time, it felt like busywork. I already knew what I wanted to study, and planning years ahead seemed early.</w:t>
       </w:r>
     </w:p>
     <w:p>
@@ -43,7 +43,7 @@
           <w:color w:val="000000"/>
           <w:sz w:val="24"/>
         </w:rPr>
-        <w:t xml:space="preserve">Looking back, the assignment gave me practice with several of the thinking skills Baldwin (2020) describes. Summarizing each article required analytical thinking, because I had to separate a source into its component parts and explain how those parts connected to my topic. Deciding whether a source was current and credible required information literacy and critical thinking, including checking the author’s credentials and possible bias. The Vanderbilt University Center for Teaching (n.d.) notes that the revised Bloom’s taxonomy ranks analyzing, evaluating, and creating above simply remembering facts.</w:t>
+        <w:t xml:space="preserve">Looking back, the assignment practiced metacognition, which Baldwin (2020) describes through three processes: planning, tracking, and assessing one’s own understanding. Building a schedule required planning, and reviewing that schedule against my degree goals is tracking. Sequencing courses around prerequisites also applied the problem-solving steps of thinking of multiple possible results and selecting the best one (Baldwin, 2020). The Vanderbilt University Center for Teaching (n.d.) lists plan among the creating-level skills in the revised Bloom’s taxonomy, so the assignment asked for more than recall.</w:t>
       </w:r>
     </w:p>
     <w:p>
@@ -57,7 +57,7 @@
           <w:color w:val="000000"/>
           <w:sz w:val="24"/>
         </w:rPr>
-        <w:t xml:space="preserve">These habits will matter in finance. When I read analyst reports, earnings releases, or financial news, I need to check who wrote the piece, when it was published, and whether the author has a stake in the conclusion, the same process I used for my sources. Writing a short annotation also prepares me to summarize a company’s financial statements accurately, stating the main figures and what they suggest without adding my own opinion. When I compare two loan or investment options, I can use the problem-solving sequence Baldwin (2020) outlines: determine the issue, recognize other perspectives, think of multiple possible results, research and evaluate them, select the best, communicate findings, and establish action items. The bibliography was not pointless after all. It taught me to examine a source before I trust it.</w:t>
+        <w:t xml:space="preserve">These skills carry over to finance. Academic planning works like financial planning: I set a goal, forecast what it requires, track progress against the plan, and adjust when something changes. I already practice this in part, on a smaller scale. I set the rates and manage payments for the party entertainment business I run with my dad, including paying our partners and him. Planning ahead is the same skill, whether the goal is a degree or a business.</w:t>
       </w:r>
     </w:p>
     <w:bookmarkStart w:id="20" w:name="references"/>

</xml_diff>